<commit_message>
Use COMSATS crest as logo; add live links and registration number to reports
- Assignment 2 Q2: replace the "CP" text mark with the COMSATS University
  crest on a white tile so it stays legible on the dark header
- Both reports: add the student registration number to the title page and a
  clickable GitHub Pages link under every question heading
- Make the live-site and repository URLs real hyperlinks
- Refresh the Q2 screenshot
</commit_message>
<xml_diff>
--- a/docs/Assignment-1-Report.docx
+++ b/docs/Assignment-1-Report.docx
@@ -144,7 +144,7 @@
                 <w:color w:val="11314A"/>
                 <w:sz w:val="19"/>
               </w:rPr>
-              <w:t>Course</w:t>
+              <w:t>Registration number</w:t>
             </w:r>
           </w:p>
         </w:tc>
@@ -166,7 +166,7 @@
               <w:rPr>
                 <w:sz w:val="19"/>
               </w:rPr>
-              <w:t>Web Technologies</w:t>
+              <w:t>SP24-BSE-006</w:t>
             </w:r>
           </w:p>
         </w:tc>
@@ -193,7 +193,7 @@
                 <w:color w:val="11314A"/>
                 <w:sz w:val="19"/>
               </w:rPr>
-              <w:t>Submission date</w:t>
+              <w:t>Course</w:t>
             </w:r>
           </w:p>
         </w:tc>
@@ -215,7 +215,7 @@
               <w:rPr>
                 <w:sz w:val="19"/>
               </w:rPr>
-              <w:t>24 September 2026</w:t>
+              <w:t>Web Technologies</w:t>
             </w:r>
           </w:p>
         </w:tc>
@@ -242,7 +242,7 @@
                 <w:color w:val="11314A"/>
                 <w:sz w:val="19"/>
               </w:rPr>
-              <w:t>Questions covered</w:t>
+              <w:t>Submission date</w:t>
             </w:r>
           </w:p>
         </w:tc>
@@ -264,7 +264,7 @@
               <w:rPr>
                 <w:sz w:val="19"/>
               </w:rPr>
-              <w:t>Q1 – Q5 (five questions)</w:t>
+              <w:t>24 September 2026</w:t>
             </w:r>
           </w:p>
         </w:tc>
@@ -291,7 +291,7 @@
                 <w:color w:val="11314A"/>
                 <w:sz w:val="19"/>
               </w:rPr>
-              <w:t>Technologies</w:t>
+              <w:t>Questions covered</w:t>
             </w:r>
           </w:p>
         </w:tc>
@@ -313,7 +313,7 @@
               <w:rPr>
                 <w:sz w:val="19"/>
               </w:rPr>
-              <w:t>HTML5, CSS3 (hand-written, no framework)</w:t>
+              <w:t>Q1 – Q5 (five questions)</w:t>
             </w:r>
           </w:p>
         </w:tc>
@@ -340,7 +340,7 @@
                 <w:color w:val="11314A"/>
                 <w:sz w:val="19"/>
               </w:rPr>
-              <w:t>Live site</w:t>
+              <w:t>Technologies</w:t>
             </w:r>
           </w:p>
         </w:tc>
@@ -362,7 +362,7 @@
               <w:rPr>
                 <w:sz w:val="19"/>
               </w:rPr>
-              <w:t>https://areeshakhan25.github.io/web-assignments/</w:t>
+              <w:t>HTML5, CSS3 (hand-written, no framework)</w:t>
             </w:r>
           </w:p>
         </w:tc>
@@ -389,7 +389,7 @@
                 <w:color w:val="11314A"/>
                 <w:sz w:val="19"/>
               </w:rPr>
-              <w:t>Source repository</w:t>
+              <w:t>Live site</w:t>
             </w:r>
           </w:p>
         </w:tc>
@@ -407,12 +407,71 @@
             <w:pPr>
               <w:spacing w:after="60"/>
             </w:pPr>
+            <w:hyperlink r:id="rId10">
+              <w:r>
+                <w:rPr>
+                  <w:color w:val="0F8A8A"/>
+                  <w:u w:val="single"/>
+                  <w:sz w:val="19"/>
+                  <w:rFonts w:ascii="Calibri" w:hAnsi="Calibri"/>
+                </w:rPr>
+                <w:t>https://areeshakhan25.github.io/web-assignments/</w:t>
+              </w:r>
+            </w:hyperlink>
+          </w:p>
+        </w:tc>
+      </w:tr>
+      <w:tr>
+        <w:tc>
+          <w:tcPr>
+            <w:tcW w:type="dxa" w:w="2736"/>
+            <w:tcBorders>
+              <w:top w:val="single" w:sz="4" w:color="D9E2E8"/>
+              <w:left w:val="single" w:sz="4" w:color="D9E2E8"/>
+              <w:bottom w:val="single" w:sz="4" w:color="D9E2E8"/>
+              <w:right w:val="single" w:sz="4" w:color="D9E2E8"/>
+            </w:tcBorders>
+            <w:shd w:val="clear" w:color="auto" w:fill="F2F6F8"/>
+          </w:tcPr>
+          <w:p>
+            <w:pPr>
+              <w:spacing w:after="60"/>
+            </w:pPr>
             <w:r>
               <w:rPr>
+                <w:b/>
+                <w:color w:val="11314A"/>
                 <w:sz w:val="19"/>
               </w:rPr>
-              <w:t>https://github.com/AreeshaKhan25/web-assignments</w:t>
-            </w:r>
+              <w:t>Source repository</w:t>
+            </w:r>
+          </w:p>
+        </w:tc>
+        <w:tc>
+          <w:tcPr>
+            <w:tcW w:type="dxa" w:w="5616"/>
+            <w:tcBorders>
+              <w:top w:val="single" w:sz="4" w:color="D9E2E8"/>
+              <w:left w:val="single" w:sz="4" w:color="D9E2E8"/>
+              <w:bottom w:val="single" w:sz="4" w:color="D9E2E8"/>
+              <w:right w:val="single" w:sz="4" w:color="D9E2E8"/>
+            </w:tcBorders>
+          </w:tcPr>
+          <w:p>
+            <w:pPr>
+              <w:spacing w:after="60"/>
+            </w:pPr>
+            <w:hyperlink r:id="rId11">
+              <w:r>
+                <w:rPr>
+                  <w:color w:val="0F8A8A"/>
+                  <w:u w:val="single"/>
+                  <w:sz w:val="19"/>
+                  <w:rFonts w:ascii="Calibri" w:hAnsi="Calibri"/>
+                </w:rPr>
+                <w:t>https://github.com/AreeshaKhan25/web-assignments</w:t>
+              </w:r>
+            </w:hyperlink>
           </w:p>
         </w:tc>
       </w:tr>
@@ -839,6 +898,59 @@
         <w:t>Practical Questions Showcase</w:t>
       </w:r>
     </w:p>
+    <w:tbl>
+      <w:tblPr>
+        <w:tblW w:type="auto" w:w="0"/>
+        <w:jc w:val="center"/>
+        <w:tblLook w:firstColumn="1" w:firstRow="1" w:lastColumn="0" w:lastRow="0" w:noHBand="0" w:noVBand="1" w:val="04A0"/>
+      </w:tblPr>
+      <w:tblGrid>
+        <w:gridCol w:w="9648"/>
+      </w:tblGrid>
+      <w:tr>
+        <w:tc>
+          <w:tcPr>
+            <w:tcW w:type="dxa" w:w="9072"/>
+            <w:shd w:val="clear" w:color="auto" w:fill="EFF6F7"/>
+            <w:tcBorders>
+              <w:top w:val="single" w:sz="4" w:color="CBE2E2"/>
+              <w:left w:val="single" w:sz="4" w:color="CBE2E2"/>
+              <w:bottom w:val="single" w:sz="4" w:color="CBE2E2"/>
+              <w:right w:val="single" w:sz="4" w:color="CBE2E2"/>
+            </w:tcBorders>
+          </w:tcPr>
+          <w:p>
+            <w:pPr>
+              <w:spacing w:before="20" w:after="20"/>
+            </w:pPr>
+            <w:r>
+              <w:rPr>
+                <w:b/>
+                <w:color w:val="11314A"/>
+                <w:sz w:val="18"/>
+              </w:rPr>
+              <w:t xml:space="preserve">Live page:  </w:t>
+            </w:r>
+            <w:hyperlink r:id="rId12">
+              <w:r>
+                <w:rPr>
+                  <w:color w:val="0F8A8A"/>
+                  <w:u w:val="single"/>
+                  <w:sz w:val="18"/>
+                  <w:rFonts w:ascii="Calibri" w:hAnsi="Calibri"/>
+                </w:rPr>
+                <w:t>https://areeshakhan25.github.io/web-assignments/assignment-1/question-1/</w:t>
+              </w:r>
+            </w:hyperlink>
+          </w:p>
+        </w:tc>
+      </w:tr>
+    </w:tbl>
+    <w:p>
+      <w:pPr>
+        <w:spacing w:after="80"/>
+      </w:pPr>
+    </w:p>
     <w:p>
       <w:pPr>
         <w:pStyle w:val="Heading2"/>
@@ -1845,7 +1957,7 @@
                     <pic:cNvPicPr/>
                   </pic:nvPicPr>
                   <pic:blipFill>
-                    <a:blip r:embed="rId10"/>
+                    <a:blip r:embed="rId13"/>
                     <a:stretch>
                       <a:fillRect/>
                     </a:stretch>
@@ -1900,6 +2012,59 @@
         <w:t>University Admission Webpage</w:t>
       </w:r>
     </w:p>
+    <w:tbl>
+      <w:tblPr>
+        <w:tblW w:type="auto" w:w="0"/>
+        <w:jc w:val="center"/>
+        <w:tblLook w:firstColumn="1" w:firstRow="1" w:lastColumn="0" w:lastRow="0" w:noHBand="0" w:noVBand="1" w:val="04A0"/>
+      </w:tblPr>
+      <w:tblGrid>
+        <w:gridCol w:w="9648"/>
+      </w:tblGrid>
+      <w:tr>
+        <w:tc>
+          <w:tcPr>
+            <w:tcW w:type="dxa" w:w="9072"/>
+            <w:shd w:val="clear" w:color="auto" w:fill="EFF6F7"/>
+            <w:tcBorders>
+              <w:top w:val="single" w:sz="4" w:color="CBE2E2"/>
+              <w:left w:val="single" w:sz="4" w:color="CBE2E2"/>
+              <w:bottom w:val="single" w:sz="4" w:color="CBE2E2"/>
+              <w:right w:val="single" w:sz="4" w:color="CBE2E2"/>
+            </w:tcBorders>
+          </w:tcPr>
+          <w:p>
+            <w:pPr>
+              <w:spacing w:before="20" w:after="20"/>
+            </w:pPr>
+            <w:r>
+              <w:rPr>
+                <w:b/>
+                <w:color w:val="11314A"/>
+                <w:sz w:val="18"/>
+              </w:rPr>
+              <w:t xml:space="preserve">Live page:  </w:t>
+            </w:r>
+            <w:hyperlink r:id="rId14">
+              <w:r>
+                <w:rPr>
+                  <w:color w:val="0F8A8A"/>
+                  <w:u w:val="single"/>
+                  <w:sz w:val="18"/>
+                  <w:rFonts w:ascii="Calibri" w:hAnsi="Calibri"/>
+                </w:rPr>
+                <w:t>https://areeshakhan25.github.io/web-assignments/assignment-1/question-2/</w:t>
+              </w:r>
+            </w:hyperlink>
+          </w:p>
+        </w:tc>
+      </w:tr>
+    </w:tbl>
+    <w:p>
+      <w:pPr>
+        <w:spacing w:after="80"/>
+      </w:pPr>
+    </w:p>
     <w:p>
       <w:pPr>
         <w:pStyle w:val="Heading2"/>
@@ -2713,7 +2878,7 @@
                     <pic:cNvPicPr/>
                   </pic:nvPicPr>
                   <pic:blipFill>
-                    <a:blip r:embed="rId11"/>
+                    <a:blip r:embed="rId15"/>
                     <a:stretch>
                       <a:fillRect/>
                     </a:stretch>
@@ -2768,6 +2933,59 @@
         <w:t>Product Advertisement Page</w:t>
       </w:r>
     </w:p>
+    <w:tbl>
+      <w:tblPr>
+        <w:tblW w:type="auto" w:w="0"/>
+        <w:jc w:val="center"/>
+        <w:tblLook w:firstColumn="1" w:firstRow="1" w:lastColumn="0" w:lastRow="0" w:noHBand="0" w:noVBand="1" w:val="04A0"/>
+      </w:tblPr>
+      <w:tblGrid>
+        <w:gridCol w:w="9648"/>
+      </w:tblGrid>
+      <w:tr>
+        <w:tc>
+          <w:tcPr>
+            <w:tcW w:type="dxa" w:w="9072"/>
+            <w:shd w:val="clear" w:color="auto" w:fill="EFF6F7"/>
+            <w:tcBorders>
+              <w:top w:val="single" w:sz="4" w:color="CBE2E2"/>
+              <w:left w:val="single" w:sz="4" w:color="CBE2E2"/>
+              <w:bottom w:val="single" w:sz="4" w:color="CBE2E2"/>
+              <w:right w:val="single" w:sz="4" w:color="CBE2E2"/>
+            </w:tcBorders>
+          </w:tcPr>
+          <w:p>
+            <w:pPr>
+              <w:spacing w:before="20" w:after="20"/>
+            </w:pPr>
+            <w:r>
+              <w:rPr>
+                <w:b/>
+                <w:color w:val="11314A"/>
+                <w:sz w:val="18"/>
+              </w:rPr>
+              <w:t xml:space="preserve">Live page:  </w:t>
+            </w:r>
+            <w:hyperlink r:id="rId16">
+              <w:r>
+                <w:rPr>
+                  <w:color w:val="0F8A8A"/>
+                  <w:u w:val="single"/>
+                  <w:sz w:val="18"/>
+                  <w:rFonts w:ascii="Calibri" w:hAnsi="Calibri"/>
+                </w:rPr>
+                <w:t>https://areeshakhan25.github.io/web-assignments/assignment-1/question-3/</w:t>
+              </w:r>
+            </w:hyperlink>
+          </w:p>
+        </w:tc>
+      </w:tr>
+    </w:tbl>
+    <w:p>
+      <w:pPr>
+        <w:spacing w:after="80"/>
+      </w:pPr>
+    </w:p>
     <w:p>
       <w:pPr>
         <w:pStyle w:val="Heading2"/>
@@ -3874,7 +4092,7 @@
                     <pic:cNvPicPr/>
                   </pic:nvPicPr>
                   <pic:blipFill>
-                    <a:blip r:embed="rId12"/>
+                    <a:blip r:embed="rId17"/>
                     <a:stretch>
                       <a:fillRect/>
                     </a:stretch>
@@ -3929,6 +4147,59 @@
         <w:t>Faculty Portal Login Interface</w:t>
       </w:r>
     </w:p>
+    <w:tbl>
+      <w:tblPr>
+        <w:tblW w:type="auto" w:w="0"/>
+        <w:jc w:val="center"/>
+        <w:tblLook w:firstColumn="1" w:firstRow="1" w:lastColumn="0" w:lastRow="0" w:noHBand="0" w:noVBand="1" w:val="04A0"/>
+      </w:tblPr>
+      <w:tblGrid>
+        <w:gridCol w:w="9648"/>
+      </w:tblGrid>
+      <w:tr>
+        <w:tc>
+          <w:tcPr>
+            <w:tcW w:type="dxa" w:w="9072"/>
+            <w:shd w:val="clear" w:color="auto" w:fill="EFF6F7"/>
+            <w:tcBorders>
+              <w:top w:val="single" w:sz="4" w:color="CBE2E2"/>
+              <w:left w:val="single" w:sz="4" w:color="CBE2E2"/>
+              <w:bottom w:val="single" w:sz="4" w:color="CBE2E2"/>
+              <w:right w:val="single" w:sz="4" w:color="CBE2E2"/>
+            </w:tcBorders>
+          </w:tcPr>
+          <w:p>
+            <w:pPr>
+              <w:spacing w:before="20" w:after="20"/>
+            </w:pPr>
+            <w:r>
+              <w:rPr>
+                <w:b/>
+                <w:color w:val="11314A"/>
+                <w:sz w:val="18"/>
+              </w:rPr>
+              <w:t xml:space="preserve">Live page:  </w:t>
+            </w:r>
+            <w:hyperlink r:id="rId18">
+              <w:r>
+                <w:rPr>
+                  <w:color w:val="0F8A8A"/>
+                  <w:u w:val="single"/>
+                  <w:sz w:val="18"/>
+                  <w:rFonts w:ascii="Calibri" w:hAnsi="Calibri"/>
+                </w:rPr>
+                <w:t>https://areeshakhan25.github.io/web-assignments/assignment-1/question-4/</w:t>
+              </w:r>
+            </w:hyperlink>
+          </w:p>
+        </w:tc>
+      </w:tr>
+    </w:tbl>
+    <w:p>
+      <w:pPr>
+        <w:spacing w:after="80"/>
+      </w:pPr>
+    </w:p>
     <w:p>
       <w:pPr>
         <w:pStyle w:val="Heading2"/>
@@ -4957,7 +5228,7 @@
                     <pic:cNvPicPr/>
                   </pic:nvPicPr>
                   <pic:blipFill>
-                    <a:blip r:embed="rId13"/>
+                    <a:blip r:embed="rId19"/>
                     <a:stretch>
                       <a:fillRect/>
                     </a:stretch>
@@ -5012,6 +5283,59 @@
         <w:t>Restaurant Menu Website</w:t>
       </w:r>
     </w:p>
+    <w:tbl>
+      <w:tblPr>
+        <w:tblW w:type="auto" w:w="0"/>
+        <w:jc w:val="center"/>
+        <w:tblLook w:firstColumn="1" w:firstRow="1" w:lastColumn="0" w:lastRow="0" w:noHBand="0" w:noVBand="1" w:val="04A0"/>
+      </w:tblPr>
+      <w:tblGrid>
+        <w:gridCol w:w="9648"/>
+      </w:tblGrid>
+      <w:tr>
+        <w:tc>
+          <w:tcPr>
+            <w:tcW w:type="dxa" w:w="9072"/>
+            <w:shd w:val="clear" w:color="auto" w:fill="EFF6F7"/>
+            <w:tcBorders>
+              <w:top w:val="single" w:sz="4" w:color="CBE2E2"/>
+              <w:left w:val="single" w:sz="4" w:color="CBE2E2"/>
+              <w:bottom w:val="single" w:sz="4" w:color="CBE2E2"/>
+              <w:right w:val="single" w:sz="4" w:color="CBE2E2"/>
+            </w:tcBorders>
+          </w:tcPr>
+          <w:p>
+            <w:pPr>
+              <w:spacing w:before="20" w:after="20"/>
+            </w:pPr>
+            <w:r>
+              <w:rPr>
+                <w:b/>
+                <w:color w:val="11314A"/>
+                <w:sz w:val="18"/>
+              </w:rPr>
+              <w:t xml:space="preserve">Live page:  </w:t>
+            </w:r>
+            <w:hyperlink r:id="rId20">
+              <w:r>
+                <w:rPr>
+                  <w:color w:val="0F8A8A"/>
+                  <w:u w:val="single"/>
+                  <w:sz w:val="18"/>
+                  <w:rFonts w:ascii="Calibri" w:hAnsi="Calibri"/>
+                </w:rPr>
+                <w:t>https://areeshakhan25.github.io/web-assignments/assignment-1/question-5/</w:t>
+              </w:r>
+            </w:hyperlink>
+          </w:p>
+        </w:tc>
+      </w:tr>
+    </w:tbl>
+    <w:p>
+      <w:pPr>
+        <w:spacing w:after="80"/>
+      </w:pPr>
+    </w:p>
     <w:p>
       <w:pPr>
         <w:pStyle w:val="Heading2"/>
@@ -6013,7 +6337,7 @@
                     <pic:cNvPicPr/>
                   </pic:nvPicPr>
                   <pic:blipFill>
-                    <a:blip r:embed="rId14"/>
+                    <a:blip r:embed="rId21"/>
                     <a:stretch>
                       <a:fillRect/>
                     </a:stretch>
@@ -6167,8 +6491,19 @@
           <w:color w:val="5B6B7A"/>
           <w:sz w:val="19"/>
         </w:rPr>
-        <w:t>All five pages are published and can be viewed live at https://areeshakhan25.github.io/web-assignments/</w:t>
+        <w:t xml:space="preserve">All five pages are published and can be viewed live at </w:t>
       </w:r>
+      <w:hyperlink r:id="rId10">
+        <w:r>
+          <w:rPr>
+            <w:color w:val="0F8A8A"/>
+            <w:u w:val="single"/>
+            <w:sz w:val="19"/>
+            <w:rFonts w:ascii="Calibri" w:hAnsi="Calibri"/>
+          </w:rPr>
+          <w:t>https://areeshakhan25.github.io/web-assignments/</w:t>
+        </w:r>
+      </w:hyperlink>
     </w:p>
     <w:sectPr>
       <w:footerReference w:type="default" r:id="rId9"/>

</xml_diff>